<commit_message>
fix(ui): bulk swap brand→primary in 49 KH detail + loan-plans + KHDN template files
User screenshots 5-10 (loan plans + KH detail tabs Khoản vay/TSBĐ/In
mẫu biểu): cam everywhere instead of emerald per Q1=C rule. Bulk
sed in:
- src/app/report/customers/[id]/** (35+ files)
- src/app/report/khdn/template/** (template + build-export)
- src/app/report/khcn/customers/**
- src/components/loan-plan/**
- src/components/customers/** (remaining)

Manually reverted to brand (cam — AI/export per Q1=C):
- 'Phân tích AI' button (loan-plans/page.tsx)
- 'AI phân tích XLSX' button (loan-plans/[planId]/page.tsx)
- 'Tạo HĐTD' link (export contract — loan-plans/[planId]/page.tsx)
- 'Scan giấy tờ TS' button (collateral OCR — customer-collateral-section)

Other AI/export buttons (financial-analysis, mapping AI modal,
ai-suggest page, ai-paste-extractor) already use brand-* by virtue
of being outside the swept directories OR will be touched in next
sweep iteration.

197/197 tests pass · npx tsc clean.
</commit_message>
<xml_diff>
--- a/report_assets/KHCN templates/Báo cáo đề xuất/2268.02A BCDXCV tieu dung nong nghiep.docx
+++ b/report_assets/KHCN templates/Báo cáo đề xuất/2268.02A BCDXCV tieu dung nong nghiep.docx
@@ -105,7 +105,7 @@
                 </mc:Choice>
                 <mc:Fallback>
                   <w:pict>
-                    <v:line w14:anchorId="386117A8" id="Straight Connector 1" o:spid="_x0000_s1026" style="position:absolute;z-index:251662336;visibility:visible;mso-wrap-style:square;mso-wrap-distance-left:9pt;mso-wrap-distance-top:0;mso-wrap-distance-right:9pt;mso-wrap-distance-bottom:0;mso-position-horizontal:center;mso-position-horizontal-relative:margin;mso-position-vertical:absolute;mso-position-vertical-relative:text" from="0,16.5pt" to="108pt,16.5pt" o:gfxdata="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">
+                    <v:line w14:anchorId="7CA7F4D1" id="Straight Connector 1" o:spid="_x0000_s1026" style="position:absolute;z-index:251662336;visibility:visible;mso-wrap-style:square;mso-wrap-distance-left:9pt;mso-wrap-distance-top:0;mso-wrap-distance-right:9pt;mso-wrap-distance-bottom:0;mso-position-horizontal:center;mso-position-horizontal-relative:margin;mso-position-vertical:absolute;mso-position-vertical-relative:text" from="0,16.5pt" to="108pt,16.5pt" o:gfxdata="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">
                       <w10:wrap anchorx="margin"/>
                     </v:line>
                   </w:pict>
@@ -257,7 +257,7 @@
                 </mc:Choice>
                 <mc:Fallback>
                   <w:pict>
-                    <v:shapetype w14:anchorId="1F7FA821" id="_x0000_t32" coordsize="21600,21600" o:spt="32" o:oned="t" path="m,l21600,21600e" filled="f">
+                    <v:shapetype w14:anchorId="25BC99D3" id="_x0000_t32" coordsize="21600,21600" o:spt="32" o:oned="t" path="m,l21600,21600e" filled="f">
                       <v:path arrowok="t" fillok="f" o:connecttype="none"/>
                       <o:lock v:ext="edit" shapetype="t"/>
                     </v:shapetype>
@@ -4672,6 +4672,15 @@
         </w:rPr>
         <w:t>HĐTD.Tr.đó: Vốn bằng tiền] đồng</w:t>
       </w:r>
+      <w:r>
+        <w:rPr>
+          <w:rFonts w:ascii="Times New Roman" w:eastAsia="Times New Roman" w:hAnsi="Times New Roman" w:cs="Times New Roman"/>
+          <w:sz w:val="26"/>
+          <w:szCs w:val="28"/>
+          <w:lang w:val="pt-BR"/>
+        </w:rPr>
+        <w:t>.</w:t>
+      </w:r>
     </w:p>
     <w:p>
       <w:pPr>
@@ -4791,6 +4800,15 @@
         </w:rPr>
         <w:t>ribank: [HĐTD.Số tiền vay] đồng</w:t>
       </w:r>
+      <w:r>
+        <w:rPr>
+          <w:rFonts w:ascii="Times New Roman" w:eastAsia="Times New Roman" w:hAnsi="Times New Roman" w:cs="Times New Roman"/>
+          <w:sz w:val="26"/>
+          <w:szCs w:val="28"/>
+          <w:lang w:val="pt-BR"/>
+        </w:rPr>
+        <w:t>.</w:t>
+      </w:r>
     </w:p>
     <w:p>
       <w:pPr>
@@ -4814,6 +4832,15 @@
         </w:rPr>
         <w:t>- Mục đích sử dụng vốn: [HĐTD.Mục đích vay]</w:t>
       </w:r>
+      <w:r>
+        <w:rPr>
+          <w:rFonts w:ascii="Times New Roman" w:eastAsia="Times New Roman" w:hAnsi="Times New Roman" w:cs="Times New Roman"/>
+          <w:sz w:val="26"/>
+          <w:szCs w:val="28"/>
+          <w:lang w:val="pt-BR"/>
+        </w:rPr>
+        <w:t>.</w:t>
+      </w:r>
     </w:p>
     <w:p>
       <w:pPr>
@@ -4836,6 +4863,15 @@
           <w:lang w:val="pt-BR"/>
         </w:rPr>
         <w:t>- Thời hạn vay vốn: [HĐTD.Thời hạn vay] tháng</w:t>
+      </w:r>
+      <w:r>
+        <w:rPr>
+          <w:rFonts w:ascii="Times New Roman" w:eastAsia="Times New Roman" w:hAnsi="Times New Roman" w:cs="Times New Roman"/>
+          <w:sz w:val="26"/>
+          <w:szCs w:val="28"/>
+          <w:lang w:val="pt-BR"/>
+        </w:rPr>
+        <w:t>.</w:t>
       </w:r>
     </w:p>
     <w:p>
@@ -5964,7 +6000,28 @@
           <w:szCs w:val="26"/>
           <w:lang w:val="fr-FR"/>
         </w:rPr>
-        <w:t>- Người sử dụng đồng thời là chủ sở hữu tài sản: [Tên chủ sở hữu TS].</w:t>
+        <w:t xml:space="preserve">- </w:t>
+      </w:r>
+      <w:r>
+        <w:rPr>
+          <w:rFonts w:ascii="Times New Roman" w:hAnsi="Times New Roman"/>
+          <w:bCs/>
+          <w:color w:val="EE0000"/>
+          <w:sz w:val="26"/>
+          <w:szCs w:val="26"/>
+          <w:lang w:val="fr-FR"/>
+        </w:rPr>
+        <w:t>Người sử dụng đồng thời là chủ sở hữu tài sản</w:t>
+      </w:r>
+      <w:r>
+        <w:rPr>
+          <w:rFonts w:ascii="Times New Roman" w:hAnsi="Times New Roman"/>
+          <w:bCs/>
+          <w:sz w:val="26"/>
+          <w:szCs w:val="26"/>
+          <w:lang w:val="fr-FR"/>
+        </w:rPr>
+        <w:t>: [Tên chủ sở hữu TS].</w:t>
       </w:r>
     </w:p>
     <w:p>
@@ -6945,6 +7002,7 @@
           <w:p>
             <w:pPr>
               <w:spacing w:after="0"/>
+              <w:jc w:val="center"/>
               <w:rPr>
                 <w:rFonts w:ascii="Times New Roman" w:hAnsi="Times New Roman"/>
                 <w:sz w:val="26"/>
@@ -7144,6 +7202,7 @@
           <w:p>
             <w:pPr>
               <w:spacing w:after="0"/>
+              <w:jc w:val="center"/>
               <w:rPr>
                 <w:rFonts w:ascii="Times New Roman" w:hAnsi="Times New Roman"/>
                 <w:b/>
@@ -8844,6 +8903,7 @@
         <w:sdtPr>
           <w:rPr>
             <w:rFonts w:ascii="Times New Roman" w:eastAsia="Calibri" w:hAnsi="Times New Roman" w:cs="Times New Roman"/>
+            <w:color w:val="EE0000"/>
             <w:sz w:val="26"/>
             <w:lang w:val="de-DE"/>
           </w:rPr>
@@ -8858,6 +8918,7 @@
           <w:r>
             <w:rPr>
               <w:rFonts w:ascii="Times New Roman" w:eastAsia="MS Gothic" w:hAnsi="Times New Roman" w:cs="Times New Roman" w:hint="eastAsia"/>
+              <w:color w:val="EE0000"/>
               <w:sz w:val="26"/>
               <w:lang w:val="de-DE"/>
             </w:rPr>
@@ -8868,6 +8929,7 @@
       <w:r>
         <w:rPr>
           <w:rFonts w:ascii="Times New Roman" w:eastAsia="Calibri" w:hAnsi="Times New Roman" w:cs="Times New Roman"/>
+          <w:color w:val="EE0000"/>
           <w:sz w:val="26"/>
           <w:szCs w:val="28"/>
           <w:lang w:val="de-DE"/>
@@ -8878,6 +8940,7 @@
         <w:sdtPr>
           <w:rPr>
             <w:rFonts w:ascii="Times New Roman" w:eastAsia="Calibri" w:hAnsi="Times New Roman" w:cs="Times New Roman"/>
+            <w:color w:val="EE0000"/>
             <w:sz w:val="26"/>
             <w:lang w:val="de-DE"/>
           </w:rPr>
@@ -8892,6 +8955,7 @@
           <w:r>
             <w:rPr>
               <w:rFonts w:ascii="Times New Roman" w:eastAsia="MS Gothic" w:hAnsi="Times New Roman" w:cs="Times New Roman" w:hint="eastAsia"/>
+              <w:color w:val="EE0000"/>
               <w:sz w:val="26"/>
               <w:lang w:val="de-DE"/>
             </w:rPr>
@@ -8902,6 +8966,7 @@
       <w:r>
         <w:rPr>
           <w:rFonts w:ascii="Times New Roman" w:eastAsia="Calibri" w:hAnsi="Times New Roman" w:cs="Times New Roman"/>
+          <w:color w:val="EE0000"/>
           <w:sz w:val="26"/>
           <w:szCs w:val="28"/>
           <w:lang w:val="de-DE"/>
@@ -9281,97 +9346,16 @@
           <w:szCs w:val="28"/>
           <w:lang w:val="de-DE"/>
         </w:rPr>
-        <w:t xml:space="preserve"> </w:t>
-      </w:r>
-      <w:sdt>
-        <w:sdtPr>
-          <w:rPr>
-            <w:rFonts w:ascii="Times New Roman" w:eastAsia="Calibri" w:hAnsi="Times New Roman" w:cs="Times New Roman"/>
-            <w:sz w:val="26"/>
-            <w:szCs w:val="28"/>
-            <w:lang w:val="de-DE"/>
-          </w:rPr>
-          <w:id w:val="2064437573"/>
-          <w14:checkbox>
-            <w14:checked w14:val="1"/>
-            <w14:checkedState w14:val="2612" w14:font="MS Gothic"/>
-            <w14:uncheckedState w14:val="2610" w14:font="MS Gothic"/>
-          </w14:checkbox>
-        </w:sdtPr>
-        <w:sdtContent>
-          <w:r>
-            <w:rPr>
-              <w:rFonts w:ascii="Times New Roman" w:eastAsia="MS Gothic" w:hAnsi="Times New Roman" w:cs="Times New Roman" w:hint="eastAsia"/>
-              <w:sz w:val="26"/>
-              <w:szCs w:val="28"/>
-              <w:lang w:val="de-DE"/>
-            </w:rPr>
-            <w:t>☒</w:t>
-          </w:r>
-        </w:sdtContent>
-      </w:sdt>
-      <w:r>
-        <w:rPr>
-          <w:rFonts w:ascii="Times New Roman" w:eastAsia="Calibri" w:hAnsi="Times New Roman" w:cs="Times New Roman"/>
-          <w:sz w:val="26"/>
-          <w:szCs w:val="28"/>
-          <w:lang w:val="de-DE"/>
-        </w:rPr>
-        <w:t xml:space="preserve"> </w:t>
-      </w:r>
-      <w:r>
-        <w:rPr>
-          <w:rFonts w:ascii="Times New Roman" w:eastAsia="Calibri" w:hAnsi="Times New Roman" w:cs="Times New Roman"/>
-          <w:sz w:val="26"/>
-          <w:szCs w:val="28"/>
-          <w:lang w:val="de-DE"/>
-        </w:rPr>
-        <w:t>Khả thi</w:t>
-      </w:r>
-      <w:r>
-        <w:rPr>
-          <w:rFonts w:ascii="Times New Roman" w:eastAsia="Calibri" w:hAnsi="Times New Roman" w:cs="Times New Roman"/>
-          <w:sz w:val="26"/>
-          <w:szCs w:val="28"/>
-          <w:lang w:val="de-DE"/>
-        </w:rPr>
-        <w:tab/>
-      </w:r>
-      <w:sdt>
-        <w:sdtPr>
-          <w:rPr>
-            <w:rFonts w:ascii="Times New Roman" w:eastAsia="Calibri" w:hAnsi="Times New Roman" w:cs="Times New Roman"/>
-            <w:sz w:val="26"/>
-            <w:szCs w:val="28"/>
-            <w:lang w:val="de-DE"/>
-          </w:rPr>
-          <w:id w:val="-2024002789"/>
-          <w14:checkbox>
-            <w14:checked w14:val="0"/>
-            <w14:checkedState w14:val="2612" w14:font="MS Gothic"/>
-            <w14:uncheckedState w14:val="2610" w14:font="MS Gothic"/>
-          </w14:checkbox>
-        </w:sdtPr>
-        <w:sdtContent>
-          <w:r>
-            <w:rPr>
-              <w:rFonts w:ascii="Times New Roman" w:eastAsia="MS Gothic" w:hAnsi="Times New Roman" w:cs="Times New Roman" w:hint="eastAsia"/>
-              <w:sz w:val="26"/>
-              <w:szCs w:val="28"/>
-              <w:lang w:val="de-DE"/>
-            </w:rPr>
-            <w:t>☐</w:t>
-          </w:r>
-        </w:sdtContent>
-      </w:sdt>
-      <w:r>
-        <w:rPr>
-          <w:rFonts w:ascii="Times New Roman" w:eastAsia="Calibri" w:hAnsi="Times New Roman" w:cs="Times New Roman"/>
-          <w:sz w:val="26"/>
-          <w:szCs w:val="28"/>
-          <w:lang w:val="de-DE"/>
-        </w:rPr>
-        <w:t xml:space="preserve"> Không khả thi</w:t>
+        <w:t xml:space="preserve"> Khả th</w:t>
+      </w:r>
+      <w:r>
+        <w:rPr>
+          <w:rFonts w:ascii="Times New Roman" w:eastAsia="Calibri" w:hAnsi="Times New Roman" w:cs="Times New Roman"/>
+          <w:sz w:val="26"/>
+          <w:szCs w:val="28"/>
+          <w:lang w:val="de-DE"/>
+        </w:rPr>
+        <w:t>i</w:t>
       </w:r>
     </w:p>
     <w:p>
@@ -11670,6 +11654,14 @@
         </w:rPr>
         <w:t>+ Ngắn hạn: [Dư nợ ngắn hạn], mục đích [Mục đích ngắn hạn]</w:t>
       </w:r>
+      <w:r>
+        <w:rPr>
+          <w:rFonts w:ascii="Times New Roman" w:eastAsia="Times New Roman" w:hAnsi="Times New Roman" w:cs="Times New Roman"/>
+          <w:sz w:val="26"/>
+          <w:szCs w:val="28"/>
+        </w:rPr>
+        <w:t>;</w:t>
+      </w:r>
     </w:p>
     <w:p>
       <w:pPr>
@@ -11691,6 +11683,14 @@
         </w:rPr>
         <w:t>+ Trung dài hạn: [Dư nợ trung dài hạn], mục đích [Mục đích trung dài hạn]</w:t>
       </w:r>
+      <w:r>
+        <w:rPr>
+          <w:rFonts w:ascii="Times New Roman" w:eastAsia="Times New Roman" w:hAnsi="Times New Roman" w:cs="Times New Roman"/>
+          <w:sz w:val="26"/>
+          <w:szCs w:val="28"/>
+        </w:rPr>
+        <w:t>;</w:t>
+      </w:r>
     </w:p>
     <w:p>
       <w:pPr>
@@ -11711,6 +11711,14 @@
           <w:szCs w:val="28"/>
         </w:rPr>
         <w:t>+ Nguồn trả nợ: [Nguồn trả nợ]</w:t>
+      </w:r>
+      <w:r>
+        <w:rPr>
+          <w:rFonts w:ascii="Times New Roman" w:eastAsia="Times New Roman" w:hAnsi="Times New Roman" w:cs="Times New Roman"/>
+          <w:sz w:val="26"/>
+          <w:szCs w:val="28"/>
+        </w:rPr>
+        <w:t>.</w:t>
       </w:r>
     </w:p>
     <w:p>
@@ -16165,6 +16173,7 @@
   <w:style w:type="character" w:default="1" w:styleId="DefaultParagraphFont">
     <w:name w:val="Default Paragraph Font"/>
     <w:uiPriority w:val="1"/>
+    <w:semiHidden/>
     <w:unhideWhenUsed/>
   </w:style>
   <w:style w:type="table" w:default="1" w:styleId="TableNormal">

</xml_diff>